<commit_message>
se actualiza la ip del servidor
</commit_message>
<xml_diff>
--- a/docs/Instalacion-servidor-AWS.docx
+++ b/docs/Instalacion-servidor-AWS.docx
@@ -520,12 +520,13 @@
             <w:tcW w:type="dxa" w:w="4986"/>
           </w:tcPr>
           <w:p>
-            <w:r/>
+            <w:r>
+              <w:t>3.17.151.210, asignada automáticamente. El 21 de octubre de 2026 era 18.118.112.206</w:t>
+            </w:r>
             <w:r>
               <w:rPr>
                 <w:sz w:val="20"/>
               </w:rPr>
-              <w:t>18.118.112.206, asignada automáticamente</w:t>
             </w:r>
           </w:p>
         </w:tc>
@@ -556,12 +557,13 @@
             <w:pPr>
               <w:shd w:fill="F7F4EE" w:val="clear"/>
             </w:pPr>
-            <w:r/>
+            <w:r>
+              <w:t>el que muestre la consola; cambia con la IP</w:t>
+            </w:r>
             <w:r>
               <w:rPr>
                 <w:sz w:val="20"/>
               </w:rPr>
-              <w:t>ec2-18-118-112-206.us-east-2.compute.amazonaws.com</w:t>
             </w:r>
           </w:p>
         </w:tc>
@@ -1155,7 +1157,7 @@
         <w:rPr>
           <w:sz w:val="22"/>
         </w:rPr>
-        <w:t>t3.micro tiene unos 913 MiB de memoria. Mientras Docker construye las imágenes, la sesión SSH puede cortarse con Broken pipe. Se vuelve a entrar y se repite el comando que quedó a medias. Una t3.small deja más margen.</w:t>
+        <w:t>t3.micro tiene unos 913 MiB de memoria. Mientras Docker construye las imágenes, la sesión SSH puede cortarse con Broken pipe. Se vuelve a entrar y se repite el comando que quedó a medias. En esta instancia hizo falta un archivo de intercambio de 2 GB. Los comandos están antes de la primera construcción. Una t3.small deja más margen.</w:t>
       </w:r>
     </w:p>
     <w:p>
@@ -1323,7 +1325,7 @@
           <w:color w:val="1C1A16"/>
           <w:sz w:val="18"/>
         </w:rPr>
-        <w:t>ssh -i "cfdesign.pem" ec2-user@ec2-18-118-112-206.us-east-2.compute.amazonaws.com</w:t>
+        <w:t>ssh -i "cfdesign.pem" ec2-user@3.17.151.210</w:t>
       </w:r>
     </w:p>
     <w:p>
@@ -1757,7 +1759,7 @@
           <w:color w:val="1C1A16"/>
           <w:sz w:val="18"/>
         </w:rPr>
-        <w:t>DJANGO_ALLOWED_HOSTS=localhost,127.0.0.1,web,nginx,18.118.112.206</w:t>
+        <w:t>DJANGO_ALLOWED_HOSTS=localhost,127.0.0.1,web,nginx,3.17.151.210</w:t>
       </w:r>
     </w:p>
     <w:p>
@@ -1771,7 +1773,7 @@
           <w:color w:val="1C1A16"/>
           <w:sz w:val="18"/>
         </w:rPr>
-        <w:t>DJANGO_CSRF_ORIGINS=http://18.118.112.206:18080,http://127.0.0.1:18080,http://localhost:18080</w:t>
+        <w:t>DJANGO_CSRF_ORIGINS=http://3.17.151.210:18080,http://127.0.0.1:18080,http://localhost:18080</w:t>
       </w:r>
     </w:p>
     <w:p>
@@ -1785,7 +1787,7 @@
           <w:color w:val="1C1A16"/>
           <w:sz w:val="18"/>
         </w:rPr>
-        <w:t>TRAZA_PUBLIC_ORIGIN=http://18.118.112.206:18080</w:t>
+        <w:t>TRAZA_PUBLIC_ORIGIN=http://3.17.151.210:18080</w:t>
       </w:r>
     </w:p>
     <w:p>
@@ -1796,7 +1798,7 @@
         <w:rPr>
           <w:sz w:val="22"/>
         </w:rPr>
-        <w:t>Si la IP pública es otra, se sustituye 18.118.112.206 en esas tres líneas. .env no se sube a Git.</w:t>
+        <w:t>Si la IP pública es otra, se sustituye 3.17.151.210 en esas tres líneas. .env no se sube a Git. Si esas variables no están en el archivo, compose.servidor.yaml sigue usando 18.118.112.206. La aplicación de escritorio, si no tiene TRAZA_API_ORIGIN, llama a http://3.17.151.210:18080.</w:t>
       </w:r>
     </w:p>
     <w:p>
@@ -1816,6 +1818,83 @@
           <w:sz w:val="22"/>
         </w:rPr>
         <w:t>Desde ~/fcdesign/FCDesign_client_server:</w:t>
+      </w:r>
+    </w:p>
+    <w:p>
+      <w:pPr/>
+      <w:r>
+        <w:rPr>
+          <w:sz w:val="22"/>
+        </w:rPr>
+        <w:t>El archivo que se usa es compose.servidor.yaml. docker compose up sin -f lee compose.yaml, que es el de desarrollo: levanta Vite y Mailpit y no es este servidor.</w:t>
+      </w:r>
+    </w:p>
+    <w:p>
+      <w:pPr/>
+      <w:r>
+        <w:rPr>
+          <w:sz w:val="22"/>
+        </w:rPr>
+        <w:t>Antes de construir, en esta t3.micro, se deja un intercambio de 2 GB. Sin él, el build se queda sin memoria. La línea de fstab lo conserva al reiniciar:</w:t>
+      </w:r>
+    </w:p>
+    <w:p>
+      <w:pPr/>
+      <w:r>
+        <w:rPr>
+          <w:rFonts w:ascii="Consolas" w:hAnsi="Consolas" w:cs="Consolas"/>
+          <w:sz w:val="18"/>
+        </w:rPr>
+        <w:t>sudo dd if=/dev/zero of=/swapfile bs=1M count=2048</w:t>
+      </w:r>
+    </w:p>
+    <w:p>
+      <w:pPr/>
+      <w:r>
+        <w:rPr>
+          <w:rFonts w:ascii="Consolas" w:hAnsi="Consolas" w:cs="Consolas"/>
+          <w:sz w:val="18"/>
+        </w:rPr>
+        <w:t>sudo chmod 600 /swapfile</w:t>
+      </w:r>
+    </w:p>
+    <w:p>
+      <w:pPr/>
+      <w:r>
+        <w:rPr>
+          <w:rFonts w:ascii="Consolas" w:hAnsi="Consolas" w:cs="Consolas"/>
+          <w:sz w:val="18"/>
+        </w:rPr>
+        <w:t>sudo mkswap /swapfile</w:t>
+      </w:r>
+    </w:p>
+    <w:p>
+      <w:pPr/>
+      <w:r>
+        <w:rPr>
+          <w:rFonts w:ascii="Consolas" w:hAnsi="Consolas" w:cs="Consolas"/>
+          <w:sz w:val="18"/>
+        </w:rPr>
+        <w:t>sudo swapon /swapfile</w:t>
+      </w:r>
+    </w:p>
+    <w:p>
+      <w:pPr/>
+      <w:r>
+        <w:rPr>
+          <w:rFonts w:ascii="Consolas" w:hAnsi="Consolas" w:cs="Consolas"/>
+          <w:sz w:val="18"/>
+        </w:rPr>
+        <w:t>echo '/swapfile none swap sw 0 0' | sudo tee -a /etc/fstab</w:t>
+      </w:r>
+    </w:p>
+    <w:p>
+      <w:pPr/>
+      <w:r>
+        <w:rPr>
+          <w:sz w:val="22"/>
+        </w:rPr>
+        <w:t>swapon --show tiene que listar /swapfile. Si el archivo ya existe, no se vuelve a crear.</w:t>
       </w:r>
     </w:p>
     <w:p>
@@ -1853,11 +1932,11 @@
       </w:pPr>
       <w:r>
         <w:rPr>
-          <w:rFonts w:ascii="Consolas" w:hAnsi="Consolas" w:eastAsia="Consolas"/>
+          <w:rFonts w:ascii="Consolas" w:hAnsi="Consolas" w:eastAsia="Consolas" w:cs="Consolas"/>
           <w:color w:val="1C1A16"/>
           <w:sz w:val="18"/>
         </w:rPr>
-        <w:t>docker compose -f compose.servidor.yaml build frontend</w:t>
+        <w:t>docker compose -f compose.servidor.yaml build nginx</w:t>
       </w:r>
     </w:p>
     <w:p>
@@ -1867,11 +1946,11 @@
       </w:pPr>
       <w:r>
         <w:rPr>
-          <w:rFonts w:ascii="Consolas" w:hAnsi="Consolas" w:eastAsia="Consolas"/>
+          <w:rFonts w:ascii="Consolas" w:hAnsi="Consolas" w:eastAsia="Consolas" w:cs="Consolas"/>
           <w:color w:val="1C1A16"/>
           <w:sz w:val="18"/>
         </w:rPr>
-        <w:t>docker compose -f compose.servidor.yaml up -d</w:t>
+        <w:t>docker compose -f compose.servidor.yaml up -d --remove-orphans</w:t>
       </w:r>
     </w:p>
     <w:p>
@@ -1882,7 +1961,7 @@
         <w:rPr>
           <w:sz w:val="22"/>
         </w:rPr>
-        <w:t>La primera construcción tarda varios minutos. Al terminar, los servicios tienen que estar en marcha: db, redis, runner, web, frontend y nginx. Postgres y Redis no publican puertos hacia internet.</w:t>
+        <w:t>La primera construcción tarda varios minutos. Nginx incluye la página ya construida: en el servidor no queda Vite. Al terminar tienen que estar en marcha db, redis, runner, web y nginx. Postgres y Redis no publican puertos hacia internet.</w:t>
       </w:r>
     </w:p>
     <w:p>
@@ -1918,7 +1997,7 @@
         <w:rPr>
           <w:sz w:val="22"/>
         </w:rPr>
-        <w:t>Tiene que responder {"ok":true}. En el navegador se abre http://18.118.112.206:18080.</w:t>
+        <w:t>Tiene que responder {"ok":true}. En el navegador se abre http://3.17.151.210:18080.</w:t>
       </w:r>
     </w:p>
     <w:p>
@@ -2042,11 +2121,11 @@
       </w:pPr>
       <w:r>
         <w:rPr>
-          <w:rFonts w:ascii="Consolas" w:hAnsi="Consolas" w:eastAsia="Consolas"/>
+          <w:rFonts w:ascii="Consolas" w:hAnsi="Consolas" w:eastAsia="Consolas" w:cs="Consolas"/>
           <w:color w:val="1C1A16"/>
           <w:sz w:val="18"/>
         </w:rPr>
-        <w:t>docker compose -f compose.servidor.yaml build frontend</w:t>
+        <w:t>docker compose -f compose.servidor.yaml build nginx</w:t>
       </w:r>
     </w:p>
     <w:p>
@@ -2056,11 +2135,11 @@
       </w:pPr>
       <w:r>
         <w:rPr>
-          <w:rFonts w:ascii="Consolas" w:hAnsi="Consolas" w:eastAsia="Consolas"/>
+          <w:rFonts w:ascii="Consolas" w:hAnsi="Consolas" w:eastAsia="Consolas" w:cs="Consolas"/>
           <w:color w:val="1C1A16"/>
           <w:sz w:val="18"/>
         </w:rPr>
-        <w:t>docker compose -f compose.servidor.yaml up -d</w:t>
+        <w:t>docker compose -f compose.servidor.yaml up -d --remove-orphans</w:t>
       </w:r>
     </w:p>
     <w:p>
@@ -2072,6 +2151,15 @@
           <w:sz w:val="22"/>
         </w:rPr>
         <w:t>down para los contenedores y conserva los volúmenes traza-db y traza-redis. Las cuentas y los algoritmos siguen ahí. down -v los borra.</w:t>
+      </w:r>
+    </w:p>
+    <w:p>
+      <w:pPr/>
+      <w:r>
+        <w:rPr>
+          <w:sz w:val="22"/>
+        </w:rPr>
+        <w:t>Si el disco se llena, df -h lo muestra y docker system df dice qué ocupa Docker. docker builder prune -f borra la caché de construcción y deja las imágenes en uso. docker system prune -af borra además las imágenes que no están en marcha: el siguiente build empieza de cero. No borra los volúmenes traza-db y traza-redis.</w:t>
       </w:r>
     </w:p>
     <w:p>
@@ -2140,7 +2228,7 @@
         <w:rPr>
           <w:sz w:val="22"/>
         </w:rPr>
-        <w:t>La dirección lleva el puerto: http://18.118.112.206:18080. El 8080 no está abierto y el navegador se queda esperando.</w:t>
+        <w:t>La dirección lleva el puerto: http://3.17.151.210:18080. El 8080 no está abierto y el navegador se queda esperando.</w:t>
       </w:r>
     </w:p>
     <w:p>
@@ -2174,6 +2262,17 @@
           <w:sz w:val="22"/>
         </w:rPr>
         <w:t>docker compose -f compose.servidor.yaml ps tiene que mostrar nginx en ejecución y el puerto 0.0.0.0:18080-&gt;80/tcp.</w:t>
+      </w:r>
+    </w:p>
+    <w:p>
+      <w:pPr>
+        <w:pStyle w:val="ListBullet"/>
+      </w:pPr>
+      <w:r>
+        <w:rPr>
+          <w:sz w:val="22"/>
+        </w:rPr>
+        <w:t>Si df -h deja el disco casi lleno, se aplica la limpieza de la sección 7 y se repite el build.</w:t>
       </w:r>
     </w:p>
     <w:sectPr>

</xml_diff>